<commit_message>
pusing day 10 task
</commit_message>
<xml_diff>
--- a/Day_10_task.docx
+++ b/Day_10_task.docx
@@ -9491,6 +9491,601 @@
       </w:pPr>
     </w:p>
     <w:p/>
+    <w:p/>
+    <w:p>
+      <w:pPr>
+        <w:pBdr>
+          <w:bottom w:val="single" w:sz="6" w:space="1" w:color="auto"/>
+        </w:pBdr>
+        <w:rPr>
+          <w:b/>
+          <w:bCs/>
+          <w:sz w:val="40"/>
+          <w:szCs w:val="40"/>
+        </w:rPr>
+      </w:pPr>
+      <w:r>
+        <w:rPr>
+          <w:b/>
+          <w:bCs/>
+          <w:sz w:val="40"/>
+          <w:szCs w:val="40"/>
+        </w:rPr>
+        <w:lastRenderedPageBreak/>
+        <w:t>Home Task:</w:t>
+      </w:r>
+    </w:p>
+    <w:p>
+      <w:pPr>
+        <w:rPr>
+          <w:b/>
+          <w:bCs/>
+        </w:rPr>
+      </w:pPr>
+    </w:p>
+    <w:p>
+      <w:pPr>
+        <w:rPr>
+          <w:b/>
+          <w:bCs/>
+        </w:rPr>
+      </w:pPr>
+      <w:r>
+        <w:rPr>
+          <w:b/>
+          <w:bCs/>
+        </w:rPr>
+        <w:t>Task 1:</w:t>
+      </w:r>
+    </w:p>
+    <w:p>
+      <w:pPr>
+        <w:rPr>
+          <w:b/>
+          <w:bCs/>
+        </w:rPr>
+      </w:pPr>
+      <w:r>
+        <w:rPr>
+          <w:b/>
+          <w:bCs/>
+        </w:rPr>
+        <w:t>What do you know about Spring MVC framework?</w:t>
+      </w:r>
+    </w:p>
+    <w:p>
+      <w:r>
+        <w:t>Spring MVC is a Java framework used to build web applications in a simple and organized way. It follows the Model-View-Controller (MVC) pattern, where the Model handles data, the View displays the user interface, and the Controller manages user requests. This separation makes the code easier to understand, maintain, and update. Spring MVC also provides features like form handling, URL mapping, and validation, making web development faster and more efficient.</w:t>
+      </w:r>
+    </w:p>
+    <w:p>
+      <w:r>
+        <w:rPr>
+          <w:noProof/>
+        </w:rPr>
+        <w:drawing>
+          <wp:inline distT="0" distB="0" distL="0" distR="0" wp14:anchorId="13326460" wp14:editId="6392C428">
+            <wp:extent cx="5731510" cy="2128434"/>
+            <wp:effectExtent l="0" t="0" r="2540" b="5715"/>
+            <wp:docPr id="2125966438" name="Picture 1" descr="Spring-MVC-Framework-Control-flow-Diagram"/>
+            <wp:cNvGraphicFramePr>
+              <a:graphicFrameLocks xmlns:a="http://schemas.openxmlformats.org/drawingml/2006/main" noChangeAspect="1"/>
+            </wp:cNvGraphicFramePr>
+            <a:graphic xmlns:a="http://schemas.openxmlformats.org/drawingml/2006/main">
+              <a:graphicData uri="http://schemas.openxmlformats.org/drawingml/2006/picture">
+                <pic:pic xmlns:pic="http://schemas.openxmlformats.org/drawingml/2006/picture">
+                  <pic:nvPicPr>
+                    <pic:cNvPr id="0" name="Picture 1" descr="Spring-MVC-Framework-Control-flow-Diagram"/>
+                    <pic:cNvPicPr>
+                      <a:picLocks noChangeAspect="1" noChangeArrowheads="1"/>
+                    </pic:cNvPicPr>
+                  </pic:nvPicPr>
+                  <pic:blipFill>
+                    <a:blip r:embed="rId5">
+                      <a:extLst>
+                        <a:ext uri="{28A0092B-C50C-407E-A947-70E740481C1C}">
+                          <a14:useLocalDpi xmlns:a14="http://schemas.microsoft.com/office/drawing/2010/main" val="0"/>
+                        </a:ext>
+                      </a:extLst>
+                    </a:blip>
+                    <a:srcRect/>
+                    <a:stretch>
+                      <a:fillRect/>
+                    </a:stretch>
+                  </pic:blipFill>
+                  <pic:spPr bwMode="auto">
+                    <a:xfrm>
+                      <a:off x="0" y="0"/>
+                      <a:ext cx="5771738" cy="2143373"/>
+                    </a:xfrm>
+                    <a:prstGeom prst="rect">
+                      <a:avLst/>
+                    </a:prstGeom>
+                    <a:noFill/>
+                    <a:ln>
+                      <a:noFill/>
+                    </a:ln>
+                  </pic:spPr>
+                </pic:pic>
+              </a:graphicData>
+            </a:graphic>
+          </wp:inline>
+        </w:drawing>
+      </w:r>
+    </w:p>
+    <w:p>
+      <w:pPr>
+        <w:pBdr>
+          <w:bottom w:val="single" w:sz="6" w:space="1" w:color="auto"/>
+        </w:pBdr>
+      </w:pPr>
+    </w:p>
+    <w:p>
+      <w:pPr>
+        <w:rPr>
+          <w:b/>
+          <w:bCs/>
+        </w:rPr>
+      </w:pPr>
+      <w:r>
+        <w:rPr>
+          <w:b/>
+          <w:bCs/>
+        </w:rPr>
+        <w:t>Task 2:</w:t>
+      </w:r>
+    </w:p>
+    <w:p>
+      <w:pPr>
+        <w:rPr>
+          <w:b/>
+          <w:bCs/>
+        </w:rPr>
+      </w:pPr>
+      <w:r>
+        <w:rPr>
+          <w:b/>
+          <w:bCs/>
+        </w:rPr>
+        <w:t>What is Dispatcher Servlet?</w:t>
+      </w:r>
+    </w:p>
+    <w:p>
+      <w:proofErr w:type="spellStart"/>
+      <w:r>
+        <w:t>DispatcherServlet</w:t>
+      </w:r>
+      <w:proofErr w:type="spellEnd"/>
+      <w:r>
+        <w:t xml:space="preserve"> in Spring is the central component of the </w:t>
+      </w:r>
+      <w:hyperlink r:id="rId6" w:tgtFrame="_blank" w:history="1">
+        <w:r>
+          <w:rPr>
+            <w:rStyle w:val="Hyperlink"/>
+            <w:u w:val="none"/>
+          </w:rPr>
+          <w:t>Spring MVC</w:t>
+        </w:r>
+      </w:hyperlink>
+      <w:r>
+        <w:t> framework that acts as the front controller. It receives all incoming HTTP requests, forwards them to the appropriate controllers, and manages the response generation process including handler mapping and view resolution.</w:t>
+      </w:r>
+    </w:p>
+    <w:p>
+      <w:pPr>
+        <w:numPr>
+          <w:ilvl w:val="0"/>
+          <w:numId w:val="2"/>
+        </w:numPr>
+      </w:pPr>
+      <w:r>
+        <w:t>Handles incoming requests and routes them to the appropriate controllers</w:t>
+      </w:r>
+    </w:p>
+    <w:p>
+      <w:pPr>
+        <w:numPr>
+          <w:ilvl w:val="0"/>
+          <w:numId w:val="3"/>
+        </w:numPr>
+      </w:pPr>
+      <w:r>
+        <w:t>Tells controllers how to handle requests and return responses.</w:t>
+      </w:r>
+    </w:p>
+    <w:p>
+      <w:pPr>
+        <w:numPr>
+          <w:ilvl w:val="0"/>
+          <w:numId w:val="4"/>
+        </w:numPr>
+      </w:pPr>
+      <w:r>
+        <w:t>After the controllers process the request, it picks the correct view to show the result (like a webpage).</w:t>
+      </w:r>
+    </w:p>
+    <w:p>
+      <w:pPr>
+        <w:pBdr>
+          <w:bottom w:val="single" w:sz="6" w:space="1" w:color="auto"/>
+        </w:pBdr>
+      </w:pPr>
+    </w:p>
+    <w:p/>
+    <w:p>
+      <w:pPr>
+        <w:rPr>
+          <w:b/>
+          <w:bCs/>
+        </w:rPr>
+      </w:pPr>
+      <w:r>
+        <w:rPr>
+          <w:b/>
+          <w:bCs/>
+        </w:rPr>
+        <w:lastRenderedPageBreak/>
+        <w:t>Task 3:</w:t>
+      </w:r>
+    </w:p>
+    <w:p>
+      <w:pPr>
+        <w:rPr>
+          <w:b/>
+          <w:bCs/>
+        </w:rPr>
+      </w:pPr>
+      <w:r>
+        <w:rPr>
+          <w:b/>
+          <w:bCs/>
+        </w:rPr>
+        <w:t>Can you explain Spring MVC with diagram</w:t>
+      </w:r>
+    </w:p>
+    <w:p>
+      <w:r>
+        <w:rPr>
+          <w:noProof/>
+        </w:rPr>
+        <w:drawing>
+          <wp:inline distT="0" distB="0" distL="0" distR="0" wp14:anchorId="6A64B964" wp14:editId="78B477FF">
+            <wp:extent cx="5731510" cy="2127885"/>
+            <wp:effectExtent l="0" t="0" r="2540" b="5715"/>
+            <wp:docPr id="1433161455" name="Picture 1" descr="Spring-MVC-Framework-Control-flow-Diagram"/>
+            <wp:cNvGraphicFramePr>
+              <a:graphicFrameLocks xmlns:a="http://schemas.openxmlformats.org/drawingml/2006/main" noChangeAspect="1"/>
+            </wp:cNvGraphicFramePr>
+            <a:graphic xmlns:a="http://schemas.openxmlformats.org/drawingml/2006/main">
+              <a:graphicData uri="http://schemas.openxmlformats.org/drawingml/2006/picture">
+                <pic:pic xmlns:pic="http://schemas.openxmlformats.org/drawingml/2006/picture">
+                  <pic:nvPicPr>
+                    <pic:cNvPr id="0" name="Picture 1" descr="Spring-MVC-Framework-Control-flow-Diagram"/>
+                    <pic:cNvPicPr>
+                      <a:picLocks noChangeAspect="1" noChangeArrowheads="1"/>
+                    </pic:cNvPicPr>
+                  </pic:nvPicPr>
+                  <pic:blipFill>
+                    <a:blip r:embed="rId5">
+                      <a:extLst>
+                        <a:ext uri="{28A0092B-C50C-407E-A947-70E740481C1C}">
+                          <a14:useLocalDpi xmlns:a14="http://schemas.microsoft.com/office/drawing/2010/main" val="0"/>
+                        </a:ext>
+                      </a:extLst>
+                    </a:blip>
+                    <a:srcRect/>
+                    <a:stretch>
+                      <a:fillRect/>
+                    </a:stretch>
+                  </pic:blipFill>
+                  <pic:spPr bwMode="auto">
+                    <a:xfrm>
+                      <a:off x="0" y="0"/>
+                      <a:ext cx="5731510" cy="2127885"/>
+                    </a:xfrm>
+                    <a:prstGeom prst="rect">
+                      <a:avLst/>
+                    </a:prstGeom>
+                    <a:noFill/>
+                    <a:ln>
+                      <a:noFill/>
+                    </a:ln>
+                  </pic:spPr>
+                </pic:pic>
+              </a:graphicData>
+            </a:graphic>
+          </wp:inline>
+        </w:drawing>
+      </w:r>
+    </w:p>
+    <w:p>
+      <w:r>
+        <w:t xml:space="preserve">This diagram shows the </w:t>
+      </w:r>
+      <w:r>
+        <w:rPr>
+          <w:b/>
+          <w:bCs/>
+        </w:rPr>
+        <w:t>working flow of the Spring MVC framework</w:t>
+      </w:r>
+      <w:r>
+        <w:t>. Here's a simple step-by-step explanation:</w:t>
+      </w:r>
+    </w:p>
+    <w:p>
+      <w:pPr>
+        <w:numPr>
+          <w:ilvl w:val="0"/>
+          <w:numId w:val="5"/>
+        </w:numPr>
+      </w:pPr>
+      <w:r>
+        <w:rPr>
+          <w:b/>
+          <w:bCs/>
+        </w:rPr>
+        <w:t>Client Request → Dispatcher Servlet</w:t>
+      </w:r>
+      <w:r>
+        <w:br/>
+        <w:t xml:space="preserve">The user sends a request (like opening a webpage). The </w:t>
+      </w:r>
+      <w:r>
+        <w:rPr>
+          <w:b/>
+          <w:bCs/>
+        </w:rPr>
+        <w:t>Dispatcher Servlet</w:t>
+      </w:r>
+      <w:r>
+        <w:t xml:space="preserve"> receives it first. </w:t>
+      </w:r>
+    </w:p>
+    <w:p>
+      <w:pPr>
+        <w:numPr>
+          <w:ilvl w:val="0"/>
+          <w:numId w:val="5"/>
+        </w:numPr>
+      </w:pPr>
+      <w:r>
+        <w:rPr>
+          <w:b/>
+          <w:bCs/>
+        </w:rPr>
+        <w:t>Dispatcher Servlet → Handler Mapping</w:t>
+      </w:r>
+      <w:r>
+        <w:br/>
+        <w:t xml:space="preserve">The Dispatcher Servlet asks the </w:t>
+      </w:r>
+      <w:r>
+        <w:rPr>
+          <w:b/>
+          <w:bCs/>
+        </w:rPr>
+        <w:t>Handler Mapping</w:t>
+      </w:r>
+      <w:r>
+        <w:t xml:space="preserve"> which controller should handle the request. </w:t>
+      </w:r>
+    </w:p>
+    <w:p>
+      <w:pPr>
+        <w:numPr>
+          <w:ilvl w:val="0"/>
+          <w:numId w:val="5"/>
+        </w:numPr>
+      </w:pPr>
+      <w:r>
+        <w:rPr>
+          <w:b/>
+          <w:bCs/>
+        </w:rPr>
+        <w:t>Handler Mapping → Dispatcher Servlet</w:t>
+      </w:r>
+      <w:r>
+        <w:br/>
+        <w:t xml:space="preserve">Handler Mapping returns the correct </w:t>
+      </w:r>
+      <w:r>
+        <w:rPr>
+          <w:b/>
+          <w:bCs/>
+        </w:rPr>
+        <w:t>Controller</w:t>
+      </w:r>
+      <w:r>
+        <w:t xml:space="preserve"> information. </w:t>
+      </w:r>
+    </w:p>
+    <w:p>
+      <w:pPr>
+        <w:numPr>
+          <w:ilvl w:val="0"/>
+          <w:numId w:val="5"/>
+        </w:numPr>
+      </w:pPr>
+      <w:r>
+        <w:rPr>
+          <w:b/>
+          <w:bCs/>
+        </w:rPr>
+        <w:t>Dispatcher Servlet → Controller</w:t>
+      </w:r>
+      <w:r>
+        <w:br/>
+        <w:t xml:space="preserve">The Dispatcher Servlet forwards the request to the selected Controller. </w:t>
+      </w:r>
+    </w:p>
+    <w:p>
+      <w:pPr>
+        <w:numPr>
+          <w:ilvl w:val="0"/>
+          <w:numId w:val="5"/>
+        </w:numPr>
+      </w:pPr>
+      <w:r>
+        <w:rPr>
+          <w:b/>
+          <w:bCs/>
+        </w:rPr>
+        <w:t>Controller → Dispatcher Servlet</w:t>
+      </w:r>
+      <w:r>
+        <w:br/>
+        <w:t xml:space="preserve">The Controller processes the request, interacts with the Model if needed, and returns a </w:t>
+      </w:r>
+      <w:r>
+        <w:rPr>
+          <w:b/>
+          <w:bCs/>
+        </w:rPr>
+        <w:t>Model and View</w:t>
+      </w:r>
+      <w:r>
+        <w:t xml:space="preserve"> object. </w:t>
+      </w:r>
+    </w:p>
+    <w:p>
+      <w:pPr>
+        <w:numPr>
+          <w:ilvl w:val="0"/>
+          <w:numId w:val="5"/>
+        </w:numPr>
+      </w:pPr>
+      <w:r>
+        <w:rPr>
+          <w:b/>
+          <w:bCs/>
+        </w:rPr>
+        <w:t>Dispatcher Servlet → View Resolver</w:t>
+      </w:r>
+      <w:r>
+        <w:br/>
+        <w:t xml:space="preserve">The Dispatcher Servlet sends the view name to the </w:t>
+      </w:r>
+      <w:r>
+        <w:rPr>
+          <w:b/>
+          <w:bCs/>
+        </w:rPr>
+        <w:t>View Resolver</w:t>
+      </w:r>
+      <w:r>
+        <w:t xml:space="preserve">. </w:t>
+      </w:r>
+    </w:p>
+    <w:p>
+      <w:pPr>
+        <w:numPr>
+          <w:ilvl w:val="0"/>
+          <w:numId w:val="5"/>
+        </w:numPr>
+      </w:pPr>
+      <w:r>
+        <w:rPr>
+          <w:b/>
+          <w:bCs/>
+        </w:rPr>
+        <w:t>View Resolver → Dispatcher Servlet</w:t>
+      </w:r>
+      <w:r>
+        <w:br/>
+        <w:t xml:space="preserve">The View Resolver finds the actual view file (such as a JSP or HTML page) and returns it. </w:t>
+      </w:r>
+    </w:p>
+    <w:p>
+      <w:pPr>
+        <w:numPr>
+          <w:ilvl w:val="0"/>
+          <w:numId w:val="5"/>
+        </w:numPr>
+      </w:pPr>
+      <w:r>
+        <w:rPr>
+          <w:b/>
+          <w:bCs/>
+        </w:rPr>
+        <w:t>Dispatcher Servlet → View</w:t>
+      </w:r>
+      <w:r>
+        <w:br/>
+        <w:t xml:space="preserve">The Dispatcher Servlet passes the model data to the View. </w:t>
+      </w:r>
+    </w:p>
+    <w:p>
+      <w:pPr>
+        <w:numPr>
+          <w:ilvl w:val="0"/>
+          <w:numId w:val="5"/>
+        </w:numPr>
+      </w:pPr>
+      <w:r>
+        <w:rPr>
+          <w:b/>
+          <w:bCs/>
+        </w:rPr>
+        <w:lastRenderedPageBreak/>
+        <w:t>View Processes the Data</w:t>
+      </w:r>
+      <w:r>
+        <w:br/>
+        <w:t xml:space="preserve">The View displays the data and prepares the final webpage. </w:t>
+      </w:r>
+    </w:p>
+    <w:p>
+      <w:pPr>
+        <w:numPr>
+          <w:ilvl w:val="0"/>
+          <w:numId w:val="5"/>
+        </w:numPr>
+      </w:pPr>
+      <w:r>
+        <w:rPr>
+          <w:b/>
+          <w:bCs/>
+        </w:rPr>
+        <w:t>Response → Client</w:t>
+      </w:r>
+      <w:r>
+        <w:br/>
+        <w:t xml:space="preserve">The Dispatcher Servlet sends the final response back to the user's browser. </w:t>
+      </w:r>
+    </w:p>
+    <w:p>
+      <w:pPr>
+        <w:rPr>
+          <w:b/>
+          <w:bCs/>
+        </w:rPr>
+      </w:pPr>
+      <w:r>
+        <w:rPr>
+          <w:b/>
+          <w:bCs/>
+        </w:rPr>
+        <w:t>Simple Flow (Easy to Remember):</w:t>
+      </w:r>
+    </w:p>
+    <w:p>
+      <w:r>
+        <w:rPr>
+          <w:b/>
+          <w:bCs/>
+        </w:rPr>
+        <w:t>Client → Dispatcher Servlet → Handler Mapping → Controller → Model &amp; View → View Resolver → View → Dispatcher Servlet → Client Response</w:t>
+      </w:r>
+    </w:p>
+    <w:p>
+      <w:pPr>
+        <w:pBdr>
+          <w:bottom w:val="single" w:sz="6" w:space="1" w:color="auto"/>
+        </w:pBdr>
+      </w:pPr>
+    </w:p>
     <w:p/>
     <w:sectPr>
       <w:pgSz w:w="11906" w:h="16838"/>
@@ -9505,6 +10100,155 @@
 <file path=word/numbering.xml><?xml version="1.0" encoding="utf-8"?>
 <w:numbering xmlns:wpc="http://schemas.microsoft.com/office/word/2010/wordprocessingCanvas" xmlns:cx="http://schemas.microsoft.com/office/drawing/2014/chartex" xmlns:cx1="http://schemas.microsoft.com/office/drawing/2015/9/8/chartex" xmlns:cx2="http://schemas.microsoft.com/office/drawing/2015/10/21/chartex" xmlns:cx3="http://schemas.microsoft.com/office/drawing/2016/5/9/chartex" xmlns:cx4="http://schemas.microsoft.com/office/drawing/2016/5/10/chartex" xmlns:cx5="http://schemas.microsoft.com/office/drawing/2016/5/11/chartex" xmlns:cx6="http://schemas.microsoft.com/office/drawing/2016/5/12/chartex" xmlns:cx7="http://schemas.microsoft.com/office/drawing/2016/5/13/chartex" xmlns:cx8="http://schemas.microsoft.com/office/drawing/2016/5/14/chartex" xmlns:mc="http://schemas.openxmlformats.org/markup-compatibility/2006" xmlns:aink="http://schemas.microsoft.com/office/drawing/2016/ink" xmlns:am3d="http://schemas.microsoft.com/office/drawing/2017/model3d" xmlns:o="urn:schemas-microsoft-com:office:office" xmlns:oel="http://schemas.microsoft.com/office/2019/extlst" xmlns:r="http://schemas.openxmlformats.org/officeDocument/2006/relationships" xmlns:m="http://schemas.openxmlformats.org/officeDocument/2006/math" xmlns:v="urn:schemas-microsoft-com:vml" xmlns:wp14="http://schemas.microsoft.com/office/word/2010/wordprocessingDrawing" xmlns:wp="http://schemas.openxmlformats.org/drawingml/2006/wordprocessingDrawing" xmlns:w10="urn:schemas-microsoft-com:office:word" xmlns:w="http://schemas.openxmlformats.org/wordprocessingml/2006/main" xmlns:w14="http://schemas.microsoft.com/office/word/2010/wordml" xmlns:w15="http://schemas.microsoft.com/office/word/2012/wordml" xmlns:w16cex="http://schemas.microsoft.com/office/word/2018/wordml/cex" xmlns:w16cid="http://schemas.microsoft.com/office/word/2016/wordml/cid" xmlns:w16="http://schemas.microsoft.com/office/word/2018/wordml" xmlns:w16du="http://schemas.microsoft.com/office/word/2023/wordml/word16du" xmlns:w16sdtdh="http://schemas.microsoft.com/office/word/2020/wordml/sdtdatahash" xmlns:w16sdtfl="http://schemas.microsoft.com/office/word/2024/wordml/sdtformatlock" xmlns:w16se="http://schemas.microsoft.com/office/word/2015/wordml/symex" xmlns:wpg="http://schemas.microsoft.com/office/word/2010/wordprocessingGroup" xmlns:wpi="http://schemas.microsoft.com/office/word/2010/wordprocessingInk" xmlns:wne="http://schemas.microsoft.com/office/word/2006/wordml" xmlns:wps="http://schemas.microsoft.com/office/word/2010/wordprocessingShape" mc:Ignorable="w14 w15 w16se w16cid w16 w16cex w16sdtdh w16sdtfl w16du wp14">
   <w:abstractNum w:abstractNumId="0" w15:restartNumberingAfterBreak="0">
+    <w:nsid w:val="07B26609"/>
+    <w:multiLevelType w:val="multilevel"/>
+    <w:tmpl w:val="89B20F16"/>
+    <w:lvl w:ilvl="0">
+      <w:start w:val="1"/>
+      <w:numFmt w:val="bullet"/>
+      <w:lvlText w:val=""/>
+      <w:lvlJc w:val="left"/>
+      <w:pPr>
+        <w:tabs>
+          <w:tab w:val="num" w:pos="720"/>
+        </w:tabs>
+        <w:ind w:left="720" w:hanging="360"/>
+      </w:pPr>
+      <w:rPr>
+        <w:rFonts w:ascii="Symbol" w:hAnsi="Symbol" w:hint="default"/>
+        <w:sz w:val="20"/>
+      </w:rPr>
+    </w:lvl>
+    <w:lvl w:ilvl="1" w:tentative="1">
+      <w:start w:val="1"/>
+      <w:numFmt w:val="bullet"/>
+      <w:lvlText w:val=""/>
+      <w:lvlJc w:val="left"/>
+      <w:pPr>
+        <w:tabs>
+          <w:tab w:val="num" w:pos="1440"/>
+        </w:tabs>
+        <w:ind w:left="1440" w:hanging="360"/>
+      </w:pPr>
+      <w:rPr>
+        <w:rFonts w:ascii="Symbol" w:hAnsi="Symbol" w:hint="default"/>
+        <w:sz w:val="20"/>
+      </w:rPr>
+    </w:lvl>
+    <w:lvl w:ilvl="2" w:tentative="1">
+      <w:start w:val="1"/>
+      <w:numFmt w:val="bullet"/>
+      <w:lvlText w:val=""/>
+      <w:lvlJc w:val="left"/>
+      <w:pPr>
+        <w:tabs>
+          <w:tab w:val="num" w:pos="2160"/>
+        </w:tabs>
+        <w:ind w:left="2160" w:hanging="360"/>
+      </w:pPr>
+      <w:rPr>
+        <w:rFonts w:ascii="Symbol" w:hAnsi="Symbol" w:hint="default"/>
+        <w:sz w:val="20"/>
+      </w:rPr>
+    </w:lvl>
+    <w:lvl w:ilvl="3" w:tentative="1">
+      <w:start w:val="1"/>
+      <w:numFmt w:val="bullet"/>
+      <w:lvlText w:val=""/>
+      <w:lvlJc w:val="left"/>
+      <w:pPr>
+        <w:tabs>
+          <w:tab w:val="num" w:pos="2880"/>
+        </w:tabs>
+        <w:ind w:left="2880" w:hanging="360"/>
+      </w:pPr>
+      <w:rPr>
+        <w:rFonts w:ascii="Symbol" w:hAnsi="Symbol" w:hint="default"/>
+        <w:sz w:val="20"/>
+      </w:rPr>
+    </w:lvl>
+    <w:lvl w:ilvl="4" w:tentative="1">
+      <w:start w:val="1"/>
+      <w:numFmt w:val="bullet"/>
+      <w:lvlText w:val=""/>
+      <w:lvlJc w:val="left"/>
+      <w:pPr>
+        <w:tabs>
+          <w:tab w:val="num" w:pos="3600"/>
+        </w:tabs>
+        <w:ind w:left="3600" w:hanging="360"/>
+      </w:pPr>
+      <w:rPr>
+        <w:rFonts w:ascii="Symbol" w:hAnsi="Symbol" w:hint="default"/>
+        <w:sz w:val="20"/>
+      </w:rPr>
+    </w:lvl>
+    <w:lvl w:ilvl="5" w:tentative="1">
+      <w:start w:val="1"/>
+      <w:numFmt w:val="bullet"/>
+      <w:lvlText w:val=""/>
+      <w:lvlJc w:val="left"/>
+      <w:pPr>
+        <w:tabs>
+          <w:tab w:val="num" w:pos="4320"/>
+        </w:tabs>
+        <w:ind w:left="4320" w:hanging="360"/>
+      </w:pPr>
+      <w:rPr>
+        <w:rFonts w:ascii="Symbol" w:hAnsi="Symbol" w:hint="default"/>
+        <w:sz w:val="20"/>
+      </w:rPr>
+    </w:lvl>
+    <w:lvl w:ilvl="6" w:tentative="1">
+      <w:start w:val="1"/>
+      <w:numFmt w:val="bullet"/>
+      <w:lvlText w:val=""/>
+      <w:lvlJc w:val="left"/>
+      <w:pPr>
+        <w:tabs>
+          <w:tab w:val="num" w:pos="5040"/>
+        </w:tabs>
+        <w:ind w:left="5040" w:hanging="360"/>
+      </w:pPr>
+      <w:rPr>
+        <w:rFonts w:ascii="Symbol" w:hAnsi="Symbol" w:hint="default"/>
+        <w:sz w:val="20"/>
+      </w:rPr>
+    </w:lvl>
+    <w:lvl w:ilvl="7" w:tentative="1">
+      <w:start w:val="1"/>
+      <w:numFmt w:val="bullet"/>
+      <w:lvlText w:val=""/>
+      <w:lvlJc w:val="left"/>
+      <w:pPr>
+        <w:tabs>
+          <w:tab w:val="num" w:pos="5760"/>
+        </w:tabs>
+        <w:ind w:left="5760" w:hanging="360"/>
+      </w:pPr>
+      <w:rPr>
+        <w:rFonts w:ascii="Symbol" w:hAnsi="Symbol" w:hint="default"/>
+        <w:sz w:val="20"/>
+      </w:rPr>
+    </w:lvl>
+    <w:lvl w:ilvl="8" w:tentative="1">
+      <w:start w:val="1"/>
+      <w:numFmt w:val="bullet"/>
+      <w:lvlText w:val=""/>
+      <w:lvlJc w:val="left"/>
+      <w:pPr>
+        <w:tabs>
+          <w:tab w:val="num" w:pos="6480"/>
+        </w:tabs>
+        <w:ind w:left="6480" w:hanging="360"/>
+      </w:pPr>
+      <w:rPr>
+        <w:rFonts w:ascii="Symbol" w:hAnsi="Symbol" w:hint="default"/>
+        <w:sz w:val="20"/>
+      </w:rPr>
+    </w:lvl>
+  </w:abstractNum>
+  <w:abstractNum w:abstractNumId="1" w15:restartNumberingAfterBreak="0">
     <w:nsid w:val="3AF9290C"/>
     <w:multiLevelType w:val="multilevel"/>
     <w:tmpl w:val="D60893B6"/>
@@ -9653,8 +10397,142 @@
       </w:rPr>
     </w:lvl>
   </w:abstractNum>
+  <w:abstractNum w:abstractNumId="2" w15:restartNumberingAfterBreak="0">
+    <w:nsid w:val="7ED337E5"/>
+    <w:multiLevelType w:val="multilevel"/>
+    <w:tmpl w:val="FF669A9A"/>
+    <w:lvl w:ilvl="0">
+      <w:start w:val="1"/>
+      <w:numFmt w:val="decimal"/>
+      <w:lvlText w:val="%1."/>
+      <w:lvlJc w:val="left"/>
+      <w:pPr>
+        <w:tabs>
+          <w:tab w:val="num" w:pos="720"/>
+        </w:tabs>
+        <w:ind w:left="720" w:hanging="360"/>
+      </w:pPr>
+    </w:lvl>
+    <w:lvl w:ilvl="1" w:tentative="1">
+      <w:start w:val="1"/>
+      <w:numFmt w:val="decimal"/>
+      <w:lvlText w:val="%2."/>
+      <w:lvlJc w:val="left"/>
+      <w:pPr>
+        <w:tabs>
+          <w:tab w:val="num" w:pos="1440"/>
+        </w:tabs>
+        <w:ind w:left="1440" w:hanging="360"/>
+      </w:pPr>
+    </w:lvl>
+    <w:lvl w:ilvl="2" w:tentative="1">
+      <w:start w:val="1"/>
+      <w:numFmt w:val="decimal"/>
+      <w:lvlText w:val="%3."/>
+      <w:lvlJc w:val="left"/>
+      <w:pPr>
+        <w:tabs>
+          <w:tab w:val="num" w:pos="2160"/>
+        </w:tabs>
+        <w:ind w:left="2160" w:hanging="360"/>
+      </w:pPr>
+    </w:lvl>
+    <w:lvl w:ilvl="3" w:tentative="1">
+      <w:start w:val="1"/>
+      <w:numFmt w:val="decimal"/>
+      <w:lvlText w:val="%4."/>
+      <w:lvlJc w:val="left"/>
+      <w:pPr>
+        <w:tabs>
+          <w:tab w:val="num" w:pos="2880"/>
+        </w:tabs>
+        <w:ind w:left="2880" w:hanging="360"/>
+      </w:pPr>
+    </w:lvl>
+    <w:lvl w:ilvl="4" w:tentative="1">
+      <w:start w:val="1"/>
+      <w:numFmt w:val="decimal"/>
+      <w:lvlText w:val="%5."/>
+      <w:lvlJc w:val="left"/>
+      <w:pPr>
+        <w:tabs>
+          <w:tab w:val="num" w:pos="3600"/>
+        </w:tabs>
+        <w:ind w:left="3600" w:hanging="360"/>
+      </w:pPr>
+    </w:lvl>
+    <w:lvl w:ilvl="5" w:tentative="1">
+      <w:start w:val="1"/>
+      <w:numFmt w:val="decimal"/>
+      <w:lvlText w:val="%6."/>
+      <w:lvlJc w:val="left"/>
+      <w:pPr>
+        <w:tabs>
+          <w:tab w:val="num" w:pos="4320"/>
+        </w:tabs>
+        <w:ind w:left="4320" w:hanging="360"/>
+      </w:pPr>
+    </w:lvl>
+    <w:lvl w:ilvl="6" w:tentative="1">
+      <w:start w:val="1"/>
+      <w:numFmt w:val="decimal"/>
+      <w:lvlText w:val="%7."/>
+      <w:lvlJc w:val="left"/>
+      <w:pPr>
+        <w:tabs>
+          <w:tab w:val="num" w:pos="5040"/>
+        </w:tabs>
+        <w:ind w:left="5040" w:hanging="360"/>
+      </w:pPr>
+    </w:lvl>
+    <w:lvl w:ilvl="7" w:tentative="1">
+      <w:start w:val="1"/>
+      <w:numFmt w:val="decimal"/>
+      <w:lvlText w:val="%8."/>
+      <w:lvlJc w:val="left"/>
+      <w:pPr>
+        <w:tabs>
+          <w:tab w:val="num" w:pos="5760"/>
+        </w:tabs>
+        <w:ind w:left="5760" w:hanging="360"/>
+      </w:pPr>
+    </w:lvl>
+    <w:lvl w:ilvl="8" w:tentative="1">
+      <w:start w:val="1"/>
+      <w:numFmt w:val="decimal"/>
+      <w:lvlText w:val="%9."/>
+      <w:lvlJc w:val="left"/>
+      <w:pPr>
+        <w:tabs>
+          <w:tab w:val="num" w:pos="6480"/>
+        </w:tabs>
+        <w:ind w:left="6480" w:hanging="360"/>
+      </w:pPr>
+    </w:lvl>
+  </w:abstractNum>
   <w:num w:numId="1" w16cid:durableId="559248696">
+    <w:abstractNumId w:val="1"/>
+  </w:num>
+  <w:num w:numId="2" w16cid:durableId="131102849">
     <w:abstractNumId w:val="0"/>
+    <w:lvlOverride w:ilvl="0">
+      <w:startOverride w:val="1"/>
+    </w:lvlOverride>
+  </w:num>
+  <w:num w:numId="3" w16cid:durableId="20906355">
+    <w:abstractNumId w:val="0"/>
+    <w:lvlOverride w:ilvl="0">
+      <w:startOverride w:val="2"/>
+    </w:lvlOverride>
+  </w:num>
+  <w:num w:numId="4" w16cid:durableId="1385787785">
+    <w:abstractNumId w:val="0"/>
+    <w:lvlOverride w:ilvl="0">
+      <w:startOverride w:val="3"/>
+    </w:lvlOverride>
+  </w:num>
+  <w:num w:numId="5" w16cid:durableId="1434666691">
+    <w:abstractNumId w:val="2"/>
   </w:num>
 </w:numbering>
 </file>
@@ -10576,6 +11454,29 @@
       <w:spacing w:val="5"/>
     </w:rPr>
   </w:style>
+  <w:style w:type="character" w:styleId="Hyperlink">
+    <w:name w:val="Hyperlink"/>
+    <w:basedOn w:val="DefaultParagraphFont"/>
+    <w:uiPriority w:val="99"/>
+    <w:unhideWhenUsed/>
+    <w:rsid w:val="00A862CD"/>
+    <w:rPr>
+      <w:color w:val="467886" w:themeColor="hyperlink"/>
+      <w:u w:val="single"/>
+    </w:rPr>
+  </w:style>
+  <w:style w:type="character" w:styleId="UnresolvedMention">
+    <w:name w:val="Unresolved Mention"/>
+    <w:basedOn w:val="DefaultParagraphFont"/>
+    <w:uiPriority w:val="99"/>
+    <w:semiHidden/>
+    <w:unhideWhenUsed/>
+    <w:rsid w:val="00A862CD"/>
+    <w:rPr>
+      <w:color w:val="605E5C"/>
+      <w:shd w:val="clear" w:color="auto" w:fill="E1DFDD"/>
+    </w:rPr>
+  </w:style>
 </w:styles>
 </file>
 

</xml_diff>